<commit_message>
Word: match the PDF — full-bleed cover image, header logo, footer rule
The .docx now embeds page 1 of the rendered PDF as a full-bleed cover (exact
background, logo, light-blue title, year, address), runs the BioMar logo in the
page header and a thin rule + company address in the footer, and keeps the
branded body + version card. Body stays editable text.

Co-Authored-By: Claude Opus 4.8 <noreply@anthropic.com>
Claude-Session: https://claude.ai/code/session_01W3gw8scX9B7oMC33JPxjbS
</commit_message>
<xml_diff>
--- a/docs/files/Animal_Welfare_Policy__Policy_2026-01.docx
+++ b/docs/files/Animal_Welfare_Policy__Policy_2026-01.docx
@@ -2,35 +2,55 @@
 <file path=word/document.xml><?xml version="1.0" encoding="utf-8"?>
 <w:document xmlns:wpc="http://schemas.microsoft.com/office/word/2010/wordprocessingCanvas" xmlns:mo="http://schemas.microsoft.com/office/mac/office/2008/main" xmlns:mc="http://schemas.openxmlformats.org/markup-compatibility/2006" xmlns:mv="urn:schemas-microsoft-com:mac:vml" xmlns:o="urn:schemas-microsoft-com:office:office" xmlns:r="http://schemas.openxmlformats.org/officeDocument/2006/relationships" xmlns:m="http://schemas.openxmlformats.org/officeDocument/2006/math" xmlns:v="urn:schemas-microsoft-com:vml" xmlns:wp14="http://schemas.microsoft.com/office/word/2010/wordprocessingDrawing" xmlns:wp="http://schemas.openxmlformats.org/drawingml/2006/wordprocessingDrawing" xmlns:w10="urn:schemas-microsoft-com:office:word" xmlns:w="http://schemas.openxmlformats.org/wordprocessingml/2006/main" xmlns:w14="http://schemas.microsoft.com/office/word/2010/wordml" xmlns:wpg="http://schemas.microsoft.com/office/word/2010/wordprocessingGroup" xmlns:wpi="http://schemas.microsoft.com/office/word/2010/wordprocessingInk" xmlns:wne="http://schemas.microsoft.com/office/word/2006/wordml" xmlns:wps="http://schemas.microsoft.com/office/word/2010/wordprocessingShape" mc:Ignorable="w14 wp14">
   <w:body>
-    <w:p/>
-    <w:p/>
-    <w:p/>
     <w:p>
+      <w:pPr>
+        <w:spacing w:before="0" w:after="0"/>
+        <w:jc w:val="center"/>
+      </w:pPr>
       <w:r>
-        <w:rPr>
-          <w:rFonts w:ascii="Avenir Next LT Pro" w:hAnsi="Avenir Next LT Pro"/>
-          <w:b/>
-          <w:color w:val="1C4076"/>
-          <w:sz w:val="60"/>
-        </w:rPr>
-        <w:t>Animal Welfare Policy</w:t>
+        <w:drawing>
+          <wp:inline xmlns:a="http://schemas.openxmlformats.org/drawingml/2006/main" xmlns:pic="http://schemas.openxmlformats.org/drawingml/2006/picture">
+            <wp:extent cx="7560000" cy="10690955"/>
+            <wp:docPr id="1" name="Picture 1"/>
+            <wp:cNvGraphicFramePr>
+              <a:graphicFrameLocks noChangeAspect="1"/>
+            </wp:cNvGraphicFramePr>
+            <a:graphic>
+              <a:graphicData uri="http://schemas.openxmlformats.org/drawingml/2006/picture">
+                <pic:pic>
+                  <pic:nvPicPr>
+                    <pic:cNvPr id="0" name="tmp44bqlgjx.png"/>
+                    <pic:cNvPicPr/>
+                  </pic:nvPicPr>
+                  <pic:blipFill>
+                    <a:blip r:embed="rId9"/>
+                    <a:stretch>
+                      <a:fillRect/>
+                    </a:stretch>
+                  </pic:blipFill>
+                  <pic:spPr>
+                    <a:xfrm>
+                      <a:off x="0" y="0"/>
+                      <a:ext cx="7560000" cy="10690955"/>
+                    </a:xfrm>
+                    <a:prstGeom prst="rect"/>
+                  </pic:spPr>
+                </pic:pic>
+              </a:graphicData>
+            </a:graphic>
+          </wp:inline>
+        </w:drawing>
       </w:r>
     </w:p>
     <w:p>
-      <w:r>
-        <w:rPr>
-          <w:rFonts w:ascii="Avenir Next LT Pro" w:hAnsi="Avenir Next LT Pro"/>
-          <w:b/>
-          <w:color w:val="6B87A4"/>
-          <w:sz w:val="40"/>
-        </w:rPr>
-        <w:t>2026</w:t>
-      </w:r>
-    </w:p>
-    <w:p>
-      <w:r>
-        <w:br w:type="page"/>
-      </w:r>
+      <w:pPr>
+        <w:sectPr>
+          <w:pgSz w:w="11906" w:h="16838"/>
+          <w:pgMar w:top="0" w:right="0" w:bottom="0" w:left="0" w:header="0" w:footer="0" w:gutter="0"/>
+          <w:cols w:space="720"/>
+          <w:docGrid w:linePitch="360"/>
+        </w:sectPr>
+      </w:pPr>
     </w:p>
     <w:p>
       <w:pPr>
@@ -266,13 +286,13 @@
         <w:tblLook w:firstColumn="1" w:firstRow="1" w:lastColumn="0" w:lastRow="0" w:noHBand="0" w:noVBand="1" w:val="04A0"/>
       </w:tblPr>
       <w:tblGrid>
-        <w:gridCol w:w="4320"/>
-        <w:gridCol w:w="4320"/>
+        <w:gridCol w:w="5103"/>
+        <w:gridCol w:w="5103"/>
       </w:tblGrid>
       <w:tr>
         <w:tc>
           <w:tcPr>
-            <w:tcW w:type="dxa" w:w="4320"/>
+            <w:tcW w:type="dxa" w:w="5103"/>
             <w:shd w:val="clear" w:fill="1C4076"/>
           </w:tcPr>
           <w:p>
@@ -289,7 +309,7 @@
         </w:tc>
         <w:tc>
           <w:tcPr>
-            <w:tcW w:type="dxa" w:w="4320"/>
+            <w:tcW w:type="dxa" w:w="5103"/>
             <w:shd w:val="clear" w:fill="1C4076"/>
           </w:tcPr>
           <w:p>
@@ -308,7 +328,7 @@
       <w:tr>
         <w:tc>
           <w:tcPr>
-            <w:tcW w:type="dxa" w:w="4320"/>
+            <w:tcW w:type="dxa" w:w="5103"/>
           </w:tcPr>
           <w:p>
             <w:r>
@@ -353,7 +373,7 @@
         </w:tc>
         <w:tc>
           <w:tcPr>
-            <w:tcW w:type="dxa" w:w="4320"/>
+            <w:tcW w:type="dxa" w:w="5103"/>
           </w:tcPr>
           <w:p>
             <w:r>
@@ -399,10 +419,10 @@
       </w:tr>
     </w:tbl>
     <w:sectPr>
-      <w:headerReference w:type="default" r:id="rId9"/>
-      <w:footerReference w:type="default" r:id="rId10"/>
-      <w:pgSz w:w="12240" w:h="15840"/>
-      <w:pgMar w:top="1440" w:right="1800" w:bottom="1440" w:left="1800" w:header="720" w:footer="720" w:gutter="0"/>
+      <w:headerReference w:type="default" r:id="rId10"/>
+      <w:footerReference w:type="default" r:id="rId11"/>
+      <w:pgSz w:w="11906" w:h="16838"/>
+      <w:pgMar w:top="1114" w:right="850" w:bottom="1134" w:left="850" w:header="360" w:footer="400" w:gutter="0"/>
       <w:cols w:space="720"/>
       <w:docGrid w:linePitch="360"/>
     </w:sectPr>
@@ -416,6 +436,9 @@
     <w:pPr>
       <w:pStyle w:val="Footer"/>
       <w:jc w:val="center"/>
+      <w:pBdr>
+        <w:top w:val="single" w:sz="4" w:space="6" w:color="C3E4EF"/>
+      </w:pBdr>
     </w:pPr>
     <w:r>
       <w:rPr>
@@ -435,15 +458,66 @@
   <w:p>
     <w:pPr>
       <w:pStyle w:val="Header"/>
-    </w:pPr>
+      <w:tabs>
+        <w:tab w:pos="9525" w:val="right"/>
+      </w:tabs>
+      <w:jc w:val="left"/>
+    </w:pPr>
+    <w:r>
+      <w:rPr>
+        <w:rFonts w:ascii="Avenir Next LT Pro" w:hAnsi="Avenir Next LT Pro"/>
+        <w:b/>
+        <w:color w:val="1C4076"/>
+        <w:sz w:val="16"/>
+      </w:rPr>
+      <w:t>BioMar Group</w:t>
+    </w:r>
+    <w:r>
+      <w:br/>
+    </w:r>
     <w:r>
       <w:rPr>
         <w:rFonts w:ascii="Avenir Next LT Pro" w:hAnsi="Avenir Next LT Pro"/>
         <w:b w:val="0"/>
-        <w:color w:val="6B87A4"/>
+        <w:color w:val="1C4076"/>
         <w:sz w:val="16"/>
       </w:rPr>
-      <w:t>BioMar Group   ·   Animal Welfare Policy</w:t>
+      <w:t>Animal Welfare Policy</w:t>
+    </w:r>
+    <w:r>
+      <w:tab/>
+      <w:drawing>
+        <wp:inline xmlns:a="http://schemas.openxmlformats.org/drawingml/2006/main" xmlns:pic="http://schemas.openxmlformats.org/drawingml/2006/picture">
+          <wp:extent cx="469475" cy="450000"/>
+          <wp:docPr id="1" name="Picture 1"/>
+          <wp:cNvGraphicFramePr>
+            <a:graphicFrameLocks noChangeAspect="1"/>
+          </wp:cNvGraphicFramePr>
+          <a:graphic>
+            <a:graphicData uri="http://schemas.openxmlformats.org/drawingml/2006/picture">
+              <pic:pic>
+                <pic:nvPicPr>
+                  <pic:cNvPr id="0" name="logo.png"/>
+                  <pic:cNvPicPr/>
+                </pic:nvPicPr>
+                <pic:blipFill>
+                  <a:blip r:embed="rId1"/>
+                  <a:stretch>
+                    <a:fillRect/>
+                  </a:stretch>
+                </pic:blipFill>
+                <pic:spPr>
+                  <a:xfrm>
+                    <a:off x="0" y="0"/>
+                    <a:ext cx="469475" cy="450000"/>
+                  </a:xfrm>
+                  <a:prstGeom prst="rect"/>
+                </pic:spPr>
+              </pic:pic>
+            </a:graphicData>
+          </a:graphic>
+        </wp:inline>
+      </w:drawing>
     </w:r>
   </w:p>
 </w:hdr>

</xml_diff>

<commit_message>
Word header now matches the PDF: full-size BioMar logo, page-anchored top-right
The content-page header places the BioMar logo at the PDF's exact coordinates
(136x130pt, 16.6pt from the right, 16.7pt from top) as a page-anchored floating
image, with 'BioMar Group' + title top-left in navy 8pt; the body top margin
clears the logo. Footer keeps the rule + address. Visually verified page-to-page
against the PDF.

Co-Authored-By: Claude Opus 4.8 <noreply@anthropic.com>
Claude-Session: https://claude.ai/code/session_01W3gw8scX9B7oMC33JPxjbS
</commit_message>
<xml_diff>
--- a/docs/files/Animal_Welfare_Policy__Policy_2026-01.docx
+++ b/docs/files/Animal_Welfare_Policy__Policy_2026-01.docx
@@ -19,7 +19,7 @@
               <a:graphicData uri="http://schemas.openxmlformats.org/drawingml/2006/picture">
                 <pic:pic>
                   <pic:nvPicPr>
-                    <pic:cNvPr id="0" name="tmp44bqlgjx.png"/>
+                    <pic:cNvPr id="0" name="tmph_mcrqw0.png"/>
                     <pic:cNvPicPr/>
                   </pic:nvPicPr>
                   <pic:blipFill>
@@ -422,7 +422,7 @@
       <w:headerReference w:type="default" r:id="rId10"/>
       <w:footerReference w:type="default" r:id="rId11"/>
       <w:pgSz w:w="11906" w:h="16838"/>
-      <w:pgMar w:top="1114" w:right="850" w:bottom="1134" w:left="850" w:header="360" w:footer="400" w:gutter="0"/>
+      <w:pgMar w:top="2920" w:right="850" w:bottom="1134" w:left="850" w:header="680" w:footer="400" w:gutter="0"/>
       <w:cols w:space="720"/>
       <w:docGrid w:linePitch="360"/>
     </w:sectPr>
@@ -444,8 +444,8 @@
       <w:rPr>
         <w:rFonts w:ascii="Avenir Next LT Pro" w:hAnsi="Avenir Next LT Pro"/>
         <w:b w:val="0"/>
-        <w:color w:val="6B87A4"/>
-        <w:sz w:val="15"/>
+        <w:color w:val="1C4076"/>
+        <w:sz w:val="16"/>
       </w:rPr>
       <w:t>BioMar Group A/S · Kalkværksvej 16, 15. · 8000 Aarhus C · Denmark · Tel +45 86 20 49 70 · www.biomar.com</w:t>
     </w:r>
@@ -458,15 +458,13 @@
   <w:p>
     <w:pPr>
       <w:pStyle w:val="Header"/>
-      <w:tabs>
-        <w:tab w:pos="9525" w:val="right"/>
-      </w:tabs>
+      <w:spacing w:after="0"/>
       <w:jc w:val="left"/>
     </w:pPr>
     <w:r>
       <w:rPr>
         <w:rFonts w:ascii="Avenir Next LT Pro" w:hAnsi="Avenir Next LT Pro"/>
-        <w:b/>
+        <w:b w:val="0"/>
         <w:color w:val="1C4076"/>
         <w:sz w:val="16"/>
       </w:rPr>
@@ -485,14 +483,18 @@
       <w:t>Animal Welfare Policy</w:t>
     </w:r>
     <w:r>
-      <w:tab/>
       <w:drawing>
-        <wp:inline xmlns:a="http://schemas.openxmlformats.org/drawingml/2006/main" xmlns:pic="http://schemas.openxmlformats.org/drawingml/2006/picture">
-          <wp:extent cx="469475" cy="450000"/>
-          <wp:docPr id="1" name="Picture 1"/>
-          <wp:cNvGraphicFramePr>
-            <a:graphicFrameLocks noChangeAspect="1"/>
-          </wp:cNvGraphicFramePr>
+        <wp:anchor xmlns:a="http://schemas.openxmlformats.org/drawingml/2006/main" xmlns:pic="http://schemas.openxmlformats.org/drawingml/2006/picture" behindDoc="0" distT="0" distB="0" distL="0" distR="0" simplePos="0" locked="0" layoutInCell="1" allowOverlap="1" relativeHeight="2">
+          <wp:simplePos x="0" y="0"/>
+          <wp:positionH relativeFrom="page">
+            <wp:posOffset>5621985</wp:posOffset>
+          </wp:positionH>
+          <wp:positionV relativeFrom="page">
+            <wp:posOffset>212090</wp:posOffset>
+          </wp:positionV>
+          <wp:extent cx="1727200" cy="1654810"/>
+          <wp:wrapNone/>
+          <wp:docPr id="201" name="BioMar logo"/>
           <a:graphic>
             <a:graphicData uri="http://schemas.openxmlformats.org/drawingml/2006/picture">
               <pic:pic>
@@ -509,14 +511,14 @@
                 <pic:spPr>
                   <a:xfrm>
                     <a:off x="0" y="0"/>
-                    <a:ext cx="469475" cy="450000"/>
+                    <a:ext cx="1727200" cy="1654810"/>
                   </a:xfrm>
                   <a:prstGeom prst="rect"/>
                 </pic:spPr>
               </pic:pic>
             </a:graphicData>
           </a:graphic>
-        </wp:inline>
+        </wp:anchor>
       </w:drawing>
     </w:r>
   </w:p>

</xml_diff>